<commit_message>
fix(db & docs): rank leaderboard by student, include practice tests in statistics, and reconcile all 13 schema doc discrepancies
</commit_message>
<xml_diff>
--- a/vibercodeDate21-09-2026/exam-app/docs/Tổng quan chức năng.docx
+++ b/vibercodeDate21-09-2026/exam-app/docs/Tổng quan chức năng.docx
@@ -474,21 +474,7 @@
         <w:spacing w:before="40" w:after="40" w:line="276" w:lineRule="auto"/>
       </w:pPr>
       <w:r>
-        <w:rPr>
-          <w:rFonts w:ascii="Calibri" w:hAnsi="Calibri"/>
-          <w:b/>
-          <w:color w:val="262626"/>
-          <w:sz w:val="20"/>
-        </w:rPr>
-        <w:t xml:space="preserve">3. Quản trị viên (Admin): </w:t>
-      </w:r>
-      <w:r>
-        <w:rPr>
-          <w:rFonts w:ascii="Calibri" w:hAnsi="Calibri"/>
-          <w:color w:val="262626"/>
-          <w:sz w:val="20"/>
-        </w:rPr>
-        <w:t>Bắt buộc đăng nhập với quyền tối cao. Quản lý cấu hình đề thi (số câu, thời lượng, điểm đạt), quản lý lớp học và phân lớp học sinh, kiểm duyệt/phê duyệt hoặc từ chối câu hỏi do giáo viên gửi lên, quản lý kho đề (thêm/sửa/xóa, import Excel), theo dõi bảng xếp hạng linh hoạt và xem dashboard so sánh chất lượng giáo viên toàn trường.</w:t>
+        <w:t>3. Quản trị viên (Admin): Bắt buộc đăng nhập với quyền tối cao. Quản lý cấu hình đề thi (số câu, thời lượng, điểm đạt), quản lý lớp học và phân lớp học sinh, kiểm duyệt/phê duyệt hoặc từ chối câu hỏi do giáo viên gửi lên, quản lý kho đề (thêm/sửa/xóa mềm, import Excel), theo dõi bảng xếp hạng vinh danh theo học sinh và xem dashboard so sánh chất lượng giáo viên toàn trường. (Hệ thống quy chuẩn nghiêm ngặt 3 vai trò: Student, Teacher, Admin; Ban giám hiệu sử dụng tài khoản quyền Admin để theo dõi báo cáo toàn trường).</w:t>
       </w:r>
     </w:p>
     <w:p>
@@ -2625,21 +2611,7 @@
         <w:spacing w:before="40" w:after="40" w:line="276" w:lineRule="auto"/>
       </w:pPr>
       <w:r>
-        <w:rPr>
-          <w:rFonts w:ascii="Calibri" w:hAnsi="Calibri"/>
-          <w:b/>
-          <w:color w:val="262626"/>
-          <w:sz w:val="20"/>
-        </w:rPr>
-        <w:t xml:space="preserve">Cấu hình Điểm Chuẩn Đạt (Pass Threshold): </w:t>
-      </w:r>
-      <w:r>
-        <w:rPr>
-          <w:rFonts w:ascii="Calibri" w:hAnsi="Calibri"/>
-          <w:color w:val="262626"/>
-          <w:sz w:val="20"/>
-        </w:rPr>
-        <w:t>Admin có thể cấu hình ngưỡng điểm tối thiểu để được công nhận là 'ĐẠT (PASS)' (mặc định: 5.0 điểm / 10). Hệ thống dựa vào ngưỡng này để hiển thị màu Xanh/Đỏ trên giao diện kết quả của học sinh.</w:t>
+        <w:t>Cấu hình Điểm Chuẩn Đạt (Pass Threshold): Thang điểm áp dụng toàn hệ thống là Thang 10 chuẩn quốc gia (0 - 10 điểm). Ngưỡng điểm chuẩn mặc định để công nhận 'ĐẠT (PASS)' là 5.0 điểm / 10 (mức Trung bình). Tuy nhiên, Admin có toàn quyền tùy biến nâng hoặc hạ ngưỡng điểm đạt này trong từng cấu hình đề thi (exam_configs.pass_score, ví dụ: đặt 6.0 hoặc 7.0 đối với đề thi chọn lọc, hoặc 5.0 đối với kiểm tra thường xuyên). Khi học sinh nộp bài, hệ thống so sánh điểm thi với ngưỡng pass_score của chính đề thi đó để hiển thị mã màu Xanh (Đạt: điểm &gt;= pass_score) hoặc màu Đỏ (Chưa đạt: điểm &lt; pass_score).</w:t>
       </w:r>
     </w:p>
     <w:p>
@@ -3792,21 +3764,7 @@
         <w:spacing w:before="40" w:after="40" w:line="276" w:lineRule="auto"/>
       </w:pPr>
       <w:r>
-        <w:rPr>
-          <w:rFonts w:ascii="Calibri" w:hAnsi="Calibri"/>
-          <w:b/>
-          <w:color w:val="262626"/>
-          <w:sz w:val="20"/>
-        </w:rPr>
-        <w:t xml:space="preserve">Cơ chế Xóa mềm (Soft Delete): </w:t>
-      </w:r>
-      <w:r>
-        <w:rPr>
-          <w:rFonts w:ascii="Calibri" w:hAnsi="Calibri"/>
-          <w:color w:val="262626"/>
-          <w:sz w:val="20"/>
-        </w:rPr>
-        <w:t>Học viên có thể ẩn bài thi cũ khỏi danh sách cá nhân qua cơ chế Xóa Mềm (Soft Delete - is_deleted = true), dữ liệu gốc vẫn lưu trong DB cho Admin và Giáo viên theo dõi.</w:t>
+        <w:t>Cơ chế Xóa mềm (Soft Delete): Học viên có thể ẩn bài thi cũ khỏi danh sách cá nhân qua cơ chế Xóa Mềm (Soft Delete - cờ is_student_deleted = true), dữ liệu gốc vẫn lưu toàn vẹn trong CSDL để Giáo viên phụ trách môn và Admin theo dõi, đánh giá và lập báo cáo.</w:t>
       </w:r>
     </w:p>
     <w:p>
@@ -4127,21 +4085,7 @@
         <w:spacing w:before="40" w:after="40" w:line="276" w:lineRule="auto"/>
       </w:pPr>
       <w:r>
-        <w:rPr>
-          <w:rFonts w:ascii="Calibri" w:hAnsi="Calibri"/>
-          <w:b/>
-          <w:color w:val="262626"/>
-          <w:sz w:val="20"/>
-        </w:rPr>
-        <w:t xml:space="preserve">Xóa Đơn lẻ &amp; Xóa Hàng loạt: </w:t>
-      </w:r>
-      <w:r>
-        <w:rPr>
-          <w:rFonts w:ascii="Calibri" w:hAnsi="Calibri"/>
-          <w:color w:val="262626"/>
-          <w:sz w:val="20"/>
-        </w:rPr>
-        <w:t>Hỗ trợ xóa câu hỏi đơn lẻ hoặc chọn cùng lúc nhiều câu hỏi để Xóa hàng loạt (Bulk Delete).</w:t>
+        <w:t>Xóa Đơn lẻ &amp; Xóa Hàng loạt (Xóa mềm - Soft Delete): Hỗ trợ xóa câu hỏi đơn lẻ hoặc chọn cùng lúc nhiều câu hỏi để Xóa hàng loạt. Hệ thống áp dụng cơ chế Xóa Mềm (is_deleted = true) kết hợp khóa ngoại ON DELETE RESTRICT, đảm bảo câu hỏi bị ẩn khỏi ngân hàng đề mới nhưng toàn bộ lịch sử và câu trả lời trong các bài thi cũ vẫn được bảo lưu 100% nguyên vẹn.</w:t>
       </w:r>
     </w:p>
     <w:p>
@@ -4165,21 +4109,7 @@
         <w:spacing w:before="40" w:after="40" w:line="276" w:lineRule="auto"/>
       </w:pPr>
       <w:r>
-        <w:rPr>
-          <w:rFonts w:ascii="Calibri" w:hAnsi="Calibri"/>
-          <w:b/>
-          <w:color w:val="262626"/>
-          <w:sz w:val="20"/>
-        </w:rPr>
-        <w:t xml:space="preserve">Bảng Xếp hạng Top Điểm Linh hoạt: </w:t>
-      </w:r>
-      <w:r>
-        <w:rPr>
-          <w:rFonts w:ascii="Calibri" w:hAnsi="Calibri"/>
-          <w:color w:val="262626"/>
-          <w:sz w:val="20"/>
-        </w:rPr>
-        <w:t>Xem Top 10, Top 20, Top 50 hoặc gõ số lượng bất kỳ vào Textbox (ví dụ: Top 15, Top 100) để xem danh sách dẫn đầu kỳ thi.</w:t>
+        <w:t>Bảng Xếp hạng Top Điểm Linh hoạt (Xếp hạng theo Học sinh): Bảng xếp hạng được tính THEO HỌC SINH (lấy lượt thi có điểm cao nhất của mỗi học sinh, tránh tình trạng 1 học sinh thi nhiều lần chiếm hết các vị trí top). Xem Top 10, Top 20, Top 50 hoặc gõ số lượng bất kỳ vào Textbox (ví dụ: Top 15, Top 100) để xem danh sách dẫn đầu theo môn và theo kỳ thi. Cả bài thi hoàn thành lẫn bài tự động nộp khi hết giờ (timed_out) đều được xếp hạng chuẩn xác.</w:t>
       </w:r>
     </w:p>
     <w:p>
@@ -4211,21 +4141,7 @@
         <w:spacing w:before="40" w:after="40" w:line="276" w:lineRule="auto"/>
       </w:pPr>
       <w:r>
-        <w:rPr>
-          <w:rFonts w:ascii="Calibri" w:hAnsi="Calibri"/>
-          <w:b/>
-          <w:color w:val="262626"/>
-          <w:sz w:val="20"/>
-        </w:rPr>
-        <w:t xml:space="preserve">Dashboard Đánh giá Giáo viên: </w:t>
-      </w:r>
-      <w:r>
-        <w:rPr>
-          <w:rFonts w:ascii="Calibri" w:hAnsi="Calibri"/>
-          <w:color w:val="262626"/>
-          <w:sz w:val="20"/>
-        </w:rPr>
-        <w:t>Dashboard hiển thị biểu đồ so sánh điểm trung bình giữa các lớp theo từng môn để Ban giám hiệu đánh giá hiệu quả giảng dạy của giáo viên.</w:t>
+        <w:t>Dashboard Đánh giá Giáo viên: Dashboard hiển thị biểu đồ so sánh điểm trung bình giữa các lớp theo từng môn để Quản trị viên / Ban giám hiệu (sử dụng tài khoản vai trò Admin) đánh giá hiệu quả giảng dạy của giáo viên. Cả bài thi thật và bài thi thử (Practice) đều được ghi nhận vào lịch sử học tập và thống kê chất lượng lớp để có cái nhìn toàn diện.</w:t>
       </w:r>
     </w:p>
     <w:p>

</xml_diff>